<commit_message>
refactor(01.Group_E_2026): refine Chapter 4 report, Table 4.5 formatting, and forest plot readability
- Remove redundant injection method sentence from Section 4.4
- Streamline Table 4.5 introductory text to concise 2-sentence format
- Flag significant PRs in Table 4.5 with asterisk based on P < 0.05 and 95% CI excluding 1.00
- Clean Table 4.5 note to standard abbreviation definitions and significance footnote
- Summarize post-Table-4.5 narrative to report only significant adjusted prevalence ratios
- Enhance Figure 4.2 forest plot readability with horizontal panel headers and deduplicated caption
- Tighten Objective 3 summary of principal findings in Section 4.8
- Clean temporary warning mechanisms across all R analysis scripts and sync RDS checkpoints
</commit_message>
<xml_diff>
--- a/01.Group_E_2026/resources/Research proposal-final 2.docx
+++ b/01.Group_E_2026/resources/Research proposal-final 2.docx
@@ -3518,7 +3518,6 @@
           <w14:ligatures w14:val="none"/>
         </w:rPr>
       </w:pPr>
-      <w:proofErr w:type="gramStart"/>
       <w:r>
         <w:rPr>
           <w:rFonts w:ascii="Times New Roman" w:eastAsia="Times New Roman" w:hAnsi="Times New Roman" w:cs="Times New Roman"/>
@@ -3535,16 +3534,7 @@
           <w:kern w:val="0"/>
           <w14:ligatures w14:val="none"/>
         </w:rPr>
-        <w:t xml:space="preserve"> :</w:t>
-      </w:r>
-      <w:proofErr w:type="gramEnd"/>
-      <w:r>
-        <w:rPr>
-          <w:rFonts w:ascii="Times New Roman" w:eastAsia="Times New Roman" w:hAnsi="Times New Roman" w:cs="Times New Roman"/>
-          <w:kern w:val="0"/>
-          <w14:ligatures w14:val="none"/>
-        </w:rPr>
-        <w:t xml:space="preserve"> Council Health Management Team</w:t>
+        <w:t xml:space="preserve"> : Council Health Management Team</w:t>
       </w:r>
     </w:p>
     <w:p>
@@ -3558,7 +3548,6 @@
           <w14:ligatures w14:val="none"/>
         </w:rPr>
       </w:pPr>
-      <w:proofErr w:type="gramStart"/>
       <w:r>
         <w:rPr>
           <w:rFonts w:ascii="Times New Roman" w:eastAsia="Times New Roman" w:hAnsi="Times New Roman" w:cs="Times New Roman"/>
@@ -3575,16 +3564,7 @@
           <w:kern w:val="0"/>
           <w14:ligatures w14:val="none"/>
         </w:rPr>
-        <w:t xml:space="preserve"> :</w:t>
-      </w:r>
-      <w:proofErr w:type="gramEnd"/>
-      <w:r>
-        <w:rPr>
-          <w:rFonts w:ascii="Times New Roman" w:eastAsia="Times New Roman" w:hAnsi="Times New Roman" w:cs="Times New Roman"/>
-          <w:kern w:val="0"/>
-          <w14:ligatures w14:val="none"/>
-        </w:rPr>
-        <w:t xml:space="preserve"> Confidence Interval</w:t>
+        <w:t xml:space="preserve"> : Confidence Interval</w:t>
       </w:r>
     </w:p>
     <w:p>
@@ -3598,7 +3578,6 @@
           <w14:ligatures w14:val="none"/>
         </w:rPr>
       </w:pPr>
-      <w:proofErr w:type="gramStart"/>
       <w:r>
         <w:rPr>
           <w:rFonts w:ascii="Times New Roman" w:eastAsia="Times New Roman" w:hAnsi="Times New Roman" w:cs="Times New Roman"/>
@@ -3615,16 +3594,7 @@
           <w:kern w:val="0"/>
           <w14:ligatures w14:val="none"/>
         </w:rPr>
-        <w:t xml:space="preserve"> :</w:t>
-      </w:r>
-      <w:proofErr w:type="gramEnd"/>
-      <w:r>
-        <w:rPr>
-          <w:rFonts w:ascii="Times New Roman" w:eastAsia="Times New Roman" w:hAnsi="Times New Roman" w:cs="Times New Roman"/>
-          <w:kern w:val="0"/>
-          <w14:ligatures w14:val="none"/>
-        </w:rPr>
-        <w:t xml:space="preserve"> Contraceptive Prevalence Rate</w:t>
+        <w:t xml:space="preserve"> : Contraceptive Prevalence Rate</w:t>
       </w:r>
     </w:p>
     <w:p>
@@ -3638,7 +3608,6 @@
           <w14:ligatures w14:val="none"/>
         </w:rPr>
       </w:pPr>
-      <w:proofErr w:type="gramStart"/>
       <w:r>
         <w:rPr>
           <w:rFonts w:ascii="Times New Roman" w:eastAsia="Times New Roman" w:hAnsi="Times New Roman" w:cs="Times New Roman"/>
@@ -3655,16 +3624,7 @@
           <w:kern w:val="0"/>
           <w14:ligatures w14:val="none"/>
         </w:rPr>
-        <w:t xml:space="preserve"> :</w:t>
-      </w:r>
-      <w:proofErr w:type="gramEnd"/>
-      <w:r>
-        <w:rPr>
-          <w:rFonts w:ascii="Times New Roman" w:eastAsia="Times New Roman" w:hAnsi="Times New Roman" w:cs="Times New Roman"/>
-          <w:kern w:val="0"/>
-          <w14:ligatures w14:val="none"/>
-        </w:rPr>
-        <w:t xml:space="preserve"> District Executive Director</w:t>
+        <w:t xml:space="preserve"> : District Executive Director</w:t>
       </w:r>
     </w:p>
     <w:p>
@@ -3678,7 +3638,6 @@
           <w14:ligatures w14:val="none"/>
         </w:rPr>
       </w:pPr>
-      <w:proofErr w:type="gramStart"/>
       <w:r>
         <w:rPr>
           <w:rFonts w:ascii="Times New Roman" w:eastAsia="Times New Roman" w:hAnsi="Times New Roman" w:cs="Times New Roman"/>
@@ -3695,16 +3654,7 @@
           <w:kern w:val="0"/>
           <w14:ligatures w14:val="none"/>
         </w:rPr>
-        <w:t xml:space="preserve"> :</w:t>
-      </w:r>
-      <w:proofErr w:type="gramEnd"/>
-      <w:r>
-        <w:rPr>
-          <w:rFonts w:ascii="Times New Roman" w:eastAsia="Times New Roman" w:hAnsi="Times New Roman" w:cs="Times New Roman"/>
-          <w:kern w:val="0"/>
-          <w14:ligatures w14:val="none"/>
-        </w:rPr>
-        <w:t xml:space="preserve"> Demographic and Health Survey</w:t>
+        <w:t xml:space="preserve"> : Demographic and Health Survey</w:t>
       </w:r>
     </w:p>
     <w:p>
@@ -3718,7 +3668,6 @@
           <w14:ligatures w14:val="none"/>
         </w:rPr>
       </w:pPr>
-      <w:proofErr w:type="gramStart"/>
       <w:r>
         <w:rPr>
           <w:rFonts w:ascii="Times New Roman" w:eastAsia="Times New Roman" w:hAnsi="Times New Roman" w:cs="Times New Roman"/>
@@ -3735,16 +3684,7 @@
           <w:kern w:val="0"/>
           <w14:ligatures w14:val="none"/>
         </w:rPr>
-        <w:t xml:space="preserve"> :</w:t>
-      </w:r>
-      <w:proofErr w:type="gramEnd"/>
-      <w:r>
-        <w:rPr>
-          <w:rFonts w:ascii="Times New Roman" w:eastAsia="Times New Roman" w:hAnsi="Times New Roman" w:cs="Times New Roman"/>
-          <w:kern w:val="0"/>
-          <w14:ligatures w14:val="none"/>
-        </w:rPr>
-        <w:t xml:space="preserve"> Family Planning</w:t>
+        <w:t xml:space="preserve"> : Family Planning</w:t>
       </w:r>
     </w:p>
     <w:p>
@@ -3758,7 +3698,6 @@
           <w14:ligatures w14:val="none"/>
         </w:rPr>
       </w:pPr>
-      <w:proofErr w:type="gramStart"/>
       <w:r>
         <w:rPr>
           <w:rFonts w:ascii="Times New Roman" w:eastAsia="Times New Roman" w:hAnsi="Times New Roman" w:cs="Times New Roman"/>
@@ -3775,16 +3714,7 @@
           <w:kern w:val="0"/>
           <w14:ligatures w14:val="none"/>
         </w:rPr>
-        <w:t xml:space="preserve"> :</w:t>
-      </w:r>
-      <w:proofErr w:type="gramEnd"/>
-      <w:r>
-        <w:rPr>
-          <w:rFonts w:ascii="Times New Roman" w:eastAsia="Times New Roman" w:hAnsi="Times New Roman" w:cs="Times New Roman"/>
-          <w:kern w:val="0"/>
-          <w14:ligatures w14:val="none"/>
-        </w:rPr>
-        <w:t xml:space="preserve"> Human Immunodeficiency Virus</w:t>
+        <w:t xml:space="preserve"> : Human Immunodeficiency Virus</w:t>
       </w:r>
     </w:p>
     <w:p>
@@ -3798,7 +3728,6 @@
           <w14:ligatures w14:val="none"/>
         </w:rPr>
       </w:pPr>
-      <w:proofErr w:type="gramStart"/>
       <w:r>
         <w:rPr>
           <w:rFonts w:ascii="Times New Roman" w:eastAsia="Times New Roman" w:hAnsi="Times New Roman" w:cs="Times New Roman"/>
@@ -3815,16 +3744,7 @@
           <w:kern w:val="0"/>
           <w14:ligatures w14:val="none"/>
         </w:rPr>
-        <w:t xml:space="preserve"> :</w:t>
-      </w:r>
-      <w:proofErr w:type="gramEnd"/>
-      <w:r>
-        <w:rPr>
-          <w:rFonts w:ascii="Times New Roman" w:eastAsia="Times New Roman" w:hAnsi="Times New Roman" w:cs="Times New Roman"/>
-          <w:kern w:val="0"/>
-          <w14:ligatures w14:val="none"/>
-        </w:rPr>
-        <w:t xml:space="preserve"> Interquartile Range</w:t>
+        <w:t xml:space="preserve"> : Interquartile Range</w:t>
       </w:r>
     </w:p>
     <w:p>
@@ -3838,7 +3758,6 @@
           <w14:ligatures w14:val="none"/>
         </w:rPr>
       </w:pPr>
-      <w:proofErr w:type="gramStart"/>
       <w:r>
         <w:rPr>
           <w:rFonts w:ascii="Times New Roman" w:eastAsia="Times New Roman" w:hAnsi="Times New Roman" w:cs="Times New Roman"/>
@@ -3855,16 +3774,7 @@
           <w:kern w:val="0"/>
           <w14:ligatures w14:val="none"/>
         </w:rPr>
-        <w:t xml:space="preserve"> :</w:t>
-      </w:r>
-      <w:proofErr w:type="gramEnd"/>
-      <w:r>
-        <w:rPr>
-          <w:rFonts w:ascii="Times New Roman" w:eastAsia="Times New Roman" w:hAnsi="Times New Roman" w:cs="Times New Roman"/>
-          <w:kern w:val="0"/>
-          <w14:ligatures w14:val="none"/>
-        </w:rPr>
-        <w:t xml:space="preserve"> Low- and Middle-Income Countries</w:t>
+        <w:t xml:space="preserve"> : Low- and Middle-Income Countries</w:t>
       </w:r>
     </w:p>
     <w:p>
@@ -3878,7 +3788,6 @@
           <w14:ligatures w14:val="none"/>
         </w:rPr>
       </w:pPr>
-      <w:proofErr w:type="gramStart"/>
       <w:r>
         <w:rPr>
           <w:rFonts w:ascii="Times New Roman" w:eastAsia="Times New Roman" w:hAnsi="Times New Roman" w:cs="Times New Roman"/>
@@ -3895,16 +3804,7 @@
           <w:kern w:val="0"/>
           <w14:ligatures w14:val="none"/>
         </w:rPr>
-        <w:t xml:space="preserve"> :</w:t>
-      </w:r>
-      <w:proofErr w:type="gramEnd"/>
-      <w:r>
-        <w:rPr>
-          <w:rFonts w:ascii="Times New Roman" w:eastAsia="Times New Roman" w:hAnsi="Times New Roman" w:cs="Times New Roman"/>
-          <w:kern w:val="0"/>
-          <w14:ligatures w14:val="none"/>
-        </w:rPr>
-        <w:t xml:space="preserve"> Doctor of Medicine</w:t>
+        <w:t xml:space="preserve"> : Doctor of Medicine</w:t>
       </w:r>
     </w:p>
     <w:p>
@@ -3918,7 +3818,6 @@
           <w14:ligatures w14:val="none"/>
         </w:rPr>
       </w:pPr>
-      <w:proofErr w:type="gramStart"/>
       <w:r>
         <w:rPr>
           <w:rFonts w:ascii="Times New Roman" w:eastAsia="Times New Roman" w:hAnsi="Times New Roman" w:cs="Times New Roman"/>
@@ -3935,16 +3834,7 @@
           <w:kern w:val="0"/>
           <w14:ligatures w14:val="none"/>
         </w:rPr>
-        <w:t xml:space="preserve"> :</w:t>
-      </w:r>
-      <w:proofErr w:type="gramEnd"/>
-      <w:r>
-        <w:rPr>
-          <w:rFonts w:ascii="Times New Roman" w:eastAsia="Times New Roman" w:hAnsi="Times New Roman" w:cs="Times New Roman"/>
-          <w:kern w:val="0"/>
-          <w14:ligatures w14:val="none"/>
-        </w:rPr>
-        <w:t xml:space="preserve"> </w:t>
+        <w:t xml:space="preserve"> : </w:t>
       </w:r>
       <w:proofErr w:type="spellStart"/>
       <w:r>
@@ -3976,7 +3866,6 @@
           <w14:ligatures w14:val="none"/>
         </w:rPr>
       </w:pPr>
-      <w:proofErr w:type="gramStart"/>
       <w:r>
         <w:rPr>
           <w:rFonts w:ascii="Times New Roman" w:eastAsia="Times New Roman" w:hAnsi="Times New Roman" w:cs="Times New Roman"/>
@@ -3993,16 +3882,7 @@
           <w:kern w:val="0"/>
           <w14:ligatures w14:val="none"/>
         </w:rPr>
-        <w:t xml:space="preserve"> :</w:t>
-      </w:r>
-      <w:proofErr w:type="gramEnd"/>
-      <w:r>
-        <w:rPr>
-          <w:rFonts w:ascii="Times New Roman" w:eastAsia="Times New Roman" w:hAnsi="Times New Roman" w:cs="Times New Roman"/>
-          <w:kern w:val="0"/>
-          <w14:ligatures w14:val="none"/>
-        </w:rPr>
-        <w:t xml:space="preserve"> National Bureau of Statistics</w:t>
+        <w:t xml:space="preserve"> : National Bureau of Statistics</w:t>
       </w:r>
     </w:p>
     <w:p>
@@ -4016,7 +3896,6 @@
           <w14:ligatures w14:val="none"/>
         </w:rPr>
       </w:pPr>
-      <w:proofErr w:type="gramStart"/>
       <w:r>
         <w:rPr>
           <w:rFonts w:ascii="Times New Roman" w:eastAsia="Times New Roman" w:hAnsi="Times New Roman" w:cs="Times New Roman"/>
@@ -4033,16 +3912,7 @@
           <w:kern w:val="0"/>
           <w14:ligatures w14:val="none"/>
         </w:rPr>
-        <w:t xml:space="preserve"> :</w:t>
-      </w:r>
-      <w:proofErr w:type="gramEnd"/>
-      <w:r>
-        <w:rPr>
-          <w:rFonts w:ascii="Times New Roman" w:eastAsia="Times New Roman" w:hAnsi="Times New Roman" w:cs="Times New Roman"/>
-          <w:kern w:val="0"/>
-          <w14:ligatures w14:val="none"/>
-        </w:rPr>
-        <w:t xml:space="preserve"> Office of the Chief Government Statistician</w:t>
+        <w:t xml:space="preserve"> : Office of the Chief Government Statistician</w:t>
       </w:r>
     </w:p>
     <w:p>
@@ -4056,7 +3926,6 @@
           <w14:ligatures w14:val="none"/>
         </w:rPr>
       </w:pPr>
-      <w:proofErr w:type="gramStart"/>
       <w:r>
         <w:rPr>
           <w:rFonts w:ascii="Times New Roman" w:eastAsia="Times New Roman" w:hAnsi="Times New Roman" w:cs="Times New Roman"/>
@@ -4073,16 +3942,7 @@
           <w:kern w:val="0"/>
           <w14:ligatures w14:val="none"/>
         </w:rPr>
-        <w:t xml:space="preserve"> :</w:t>
-      </w:r>
-      <w:proofErr w:type="gramEnd"/>
-      <w:r>
-        <w:rPr>
-          <w:rFonts w:ascii="Times New Roman" w:eastAsia="Times New Roman" w:hAnsi="Times New Roman" w:cs="Times New Roman"/>
-          <w:kern w:val="0"/>
-          <w14:ligatures w14:val="none"/>
-        </w:rPr>
-        <w:t xml:space="preserve"> Open Data Kit</w:t>
+        <w:t xml:space="preserve"> : Open Data Kit</w:t>
       </w:r>
     </w:p>
     <w:p>
@@ -4096,7 +3956,6 @@
           <w14:ligatures w14:val="none"/>
         </w:rPr>
       </w:pPr>
-      <w:proofErr w:type="gramStart"/>
       <w:r>
         <w:rPr>
           <w:rFonts w:ascii="Times New Roman" w:eastAsia="Times New Roman" w:hAnsi="Times New Roman" w:cs="Times New Roman"/>
@@ -4113,16 +3972,7 @@
           <w:kern w:val="0"/>
           <w14:ligatures w14:val="none"/>
         </w:rPr>
-        <w:t xml:space="preserve"> :</w:t>
-      </w:r>
-      <w:proofErr w:type="gramEnd"/>
-      <w:r>
-        <w:rPr>
-          <w:rFonts w:ascii="Times New Roman" w:eastAsia="Times New Roman" w:hAnsi="Times New Roman" w:cs="Times New Roman"/>
-          <w:kern w:val="0"/>
-          <w14:ligatures w14:val="none"/>
-        </w:rPr>
-        <w:t xml:space="preserve"> Principal Investigator</w:t>
+        <w:t xml:space="preserve"> : Principal Investigator</w:t>
       </w:r>
     </w:p>
     <w:p>
@@ -4136,7 +3986,6 @@
           <w14:ligatures w14:val="none"/>
         </w:rPr>
       </w:pPr>
-      <w:proofErr w:type="gramStart"/>
       <w:r>
         <w:rPr>
           <w:rFonts w:ascii="Times New Roman" w:eastAsia="Times New Roman" w:hAnsi="Times New Roman" w:cs="Times New Roman"/>
@@ -4153,16 +4002,7 @@
           <w:kern w:val="0"/>
           <w14:ligatures w14:val="none"/>
         </w:rPr>
-        <w:t xml:space="preserve"> :</w:t>
-      </w:r>
-      <w:proofErr w:type="gramEnd"/>
-      <w:r>
-        <w:rPr>
-          <w:rFonts w:ascii="Times New Roman" w:eastAsia="Times New Roman" w:hAnsi="Times New Roman" w:cs="Times New Roman"/>
-          <w:kern w:val="0"/>
-          <w14:ligatures w14:val="none"/>
-        </w:rPr>
-        <w:t xml:space="preserve"> Research Assistant</w:t>
+        <w:t xml:space="preserve"> : Research Assistant</w:t>
       </w:r>
     </w:p>
     <w:p>
@@ -4176,7 +4016,6 @@
           <w14:ligatures w14:val="none"/>
         </w:rPr>
       </w:pPr>
-      <w:proofErr w:type="gramStart"/>
       <w:r>
         <w:rPr>
           <w:rFonts w:ascii="Times New Roman" w:eastAsia="Times New Roman" w:hAnsi="Times New Roman" w:cs="Times New Roman"/>
@@ -4193,16 +4032,7 @@
           <w:kern w:val="0"/>
           <w14:ligatures w14:val="none"/>
         </w:rPr>
-        <w:t xml:space="preserve"> :</w:t>
-      </w:r>
-      <w:proofErr w:type="gramEnd"/>
-      <w:r>
-        <w:rPr>
-          <w:rFonts w:ascii="Times New Roman" w:eastAsia="Times New Roman" w:hAnsi="Times New Roman" w:cs="Times New Roman"/>
-          <w:kern w:val="0"/>
-          <w14:ligatures w14:val="none"/>
-        </w:rPr>
-        <w:t xml:space="preserve"> Relative Risk Ratio</w:t>
+        <w:t xml:space="preserve"> : Relative Risk Ratio</w:t>
       </w:r>
     </w:p>
     <w:p>
@@ -4216,15 +4046,15 @@
           <w14:ligatures w14:val="none"/>
         </w:rPr>
       </w:pPr>
-      <w:proofErr w:type="gramStart"/>
-      <w:r>
-        <w:rPr>
-          <w:rFonts w:ascii="Times New Roman" w:eastAsia="Times New Roman" w:hAnsi="Times New Roman" w:cs="Times New Roman"/>
-          <w:b/>
-          <w:bCs/>
-          <w:kern w:val="0"/>
-          <w14:ligatures w14:val="none"/>
-        </w:rPr>
+      <w:r>
+        <w:rPr>
+          <w:rFonts w:ascii="Times New Roman" w:eastAsia="Times New Roman" w:hAnsi="Times New Roman" w:cs="Times New Roman"/>
+          <w:b/>
+          <w:bCs/>
+          <w:kern w:val="0"/>
+          <w14:ligatures w14:val="none"/>
+        </w:rPr>
+        <w:lastRenderedPageBreak/>
         <w:t>SD</w:t>
       </w:r>
       <w:r>
@@ -4233,16 +4063,7 @@
           <w:kern w:val="0"/>
           <w14:ligatures w14:val="none"/>
         </w:rPr>
-        <w:t xml:space="preserve"> :</w:t>
-      </w:r>
-      <w:proofErr w:type="gramEnd"/>
-      <w:r>
-        <w:rPr>
-          <w:rFonts w:ascii="Times New Roman" w:eastAsia="Times New Roman" w:hAnsi="Times New Roman" w:cs="Times New Roman"/>
-          <w:kern w:val="0"/>
-          <w14:ligatures w14:val="none"/>
-        </w:rPr>
-        <w:t xml:space="preserve"> Standard Deviation</w:t>
+        <w:t xml:space="preserve"> : Standard Deviation</w:t>
       </w:r>
     </w:p>
     <w:p>
@@ -4256,16 +4077,14 @@
           <w14:ligatures w14:val="none"/>
         </w:rPr>
       </w:pPr>
-      <w:proofErr w:type="gramStart"/>
-      <w:r>
-        <w:rPr>
-          <w:rFonts w:ascii="Times New Roman" w:eastAsia="Times New Roman" w:hAnsi="Times New Roman" w:cs="Times New Roman"/>
-          <w:b/>
-          <w:bCs/>
-          <w:kern w:val="0"/>
-          <w14:ligatures w14:val="none"/>
-        </w:rPr>
-        <w:lastRenderedPageBreak/>
+      <w:r>
+        <w:rPr>
+          <w:rFonts w:ascii="Times New Roman" w:eastAsia="Times New Roman" w:hAnsi="Times New Roman" w:cs="Times New Roman"/>
+          <w:b/>
+          <w:bCs/>
+          <w:kern w:val="0"/>
+          <w14:ligatures w14:val="none"/>
+        </w:rPr>
         <w:t>SPSS</w:t>
       </w:r>
       <w:r>
@@ -4274,16 +4093,7 @@
           <w:kern w:val="0"/>
           <w14:ligatures w14:val="none"/>
         </w:rPr>
-        <w:t xml:space="preserve"> :</w:t>
-      </w:r>
-      <w:proofErr w:type="gramEnd"/>
-      <w:r>
-        <w:rPr>
-          <w:rFonts w:ascii="Times New Roman" w:eastAsia="Times New Roman" w:hAnsi="Times New Roman" w:cs="Times New Roman"/>
-          <w:kern w:val="0"/>
-          <w14:ligatures w14:val="none"/>
-        </w:rPr>
-        <w:t xml:space="preserve"> Statistical Package for the Social Sciences</w:t>
+        <w:t xml:space="preserve"> : Statistical Package for the Social Sciences</w:t>
       </w:r>
     </w:p>
     <w:p>
@@ -4297,7 +4107,6 @@
           <w14:ligatures w14:val="none"/>
         </w:rPr>
       </w:pPr>
-      <w:proofErr w:type="gramStart"/>
       <w:r>
         <w:rPr>
           <w:rFonts w:ascii="Times New Roman" w:eastAsia="Times New Roman" w:hAnsi="Times New Roman" w:cs="Times New Roman"/>
@@ -4314,16 +4123,7 @@
           <w:kern w:val="0"/>
           <w14:ligatures w14:val="none"/>
         </w:rPr>
-        <w:t xml:space="preserve"> :</w:t>
-      </w:r>
-      <w:proofErr w:type="gramEnd"/>
-      <w:r>
-        <w:rPr>
-          <w:rFonts w:ascii="Times New Roman" w:eastAsia="Times New Roman" w:hAnsi="Times New Roman" w:cs="Times New Roman"/>
-          <w:kern w:val="0"/>
-          <w14:ligatures w14:val="none"/>
-        </w:rPr>
-        <w:t xml:space="preserve"> Sub-Saharan Africa</w:t>
+        <w:t xml:space="preserve"> : Sub-Saharan Africa</w:t>
       </w:r>
     </w:p>
     <w:p>
@@ -4337,7 +4137,6 @@
           <w14:ligatures w14:val="none"/>
         </w:rPr>
       </w:pPr>
-      <w:proofErr w:type="gramStart"/>
       <w:r>
         <w:rPr>
           <w:rFonts w:ascii="Times New Roman" w:eastAsia="Times New Roman" w:hAnsi="Times New Roman" w:cs="Times New Roman"/>
@@ -4354,16 +4153,7 @@
           <w:kern w:val="0"/>
           <w14:ligatures w14:val="none"/>
         </w:rPr>
-        <w:t xml:space="preserve"> :</w:t>
-      </w:r>
-      <w:proofErr w:type="gramEnd"/>
-      <w:r>
-        <w:rPr>
-          <w:rFonts w:ascii="Times New Roman" w:eastAsia="Times New Roman" w:hAnsi="Times New Roman" w:cs="Times New Roman"/>
-          <w:kern w:val="0"/>
-          <w14:ligatures w14:val="none"/>
-        </w:rPr>
-        <w:t xml:space="preserve"> Sexually Transmitted Diseases</w:t>
+        <w:t xml:space="preserve"> : Sexually Transmitted Diseases</w:t>
       </w:r>
     </w:p>
     <w:p>
@@ -4377,7 +4167,6 @@
           <w14:ligatures w14:val="none"/>
         </w:rPr>
       </w:pPr>
-      <w:proofErr w:type="gramStart"/>
       <w:r>
         <w:rPr>
           <w:rFonts w:ascii="Times New Roman" w:eastAsia="Times New Roman" w:hAnsi="Times New Roman" w:cs="Times New Roman"/>
@@ -4394,16 +4183,7 @@
           <w:kern w:val="0"/>
           <w14:ligatures w14:val="none"/>
         </w:rPr>
-        <w:t xml:space="preserve"> :</w:t>
-      </w:r>
-      <w:proofErr w:type="gramEnd"/>
-      <w:r>
-        <w:rPr>
-          <w:rFonts w:ascii="Times New Roman" w:eastAsia="Times New Roman" w:hAnsi="Times New Roman" w:cs="Times New Roman"/>
-          <w:kern w:val="0"/>
-          <w14:ligatures w14:val="none"/>
-        </w:rPr>
-        <w:t xml:space="preserve"> Tanzania Demographic and Health Survey</w:t>
+        <w:t xml:space="preserve"> : Tanzania Demographic and Health Survey</w:t>
       </w:r>
     </w:p>
     <w:p>
@@ -4417,7 +4197,6 @@
           <w14:ligatures w14:val="none"/>
         </w:rPr>
       </w:pPr>
-      <w:proofErr w:type="gramStart"/>
       <w:r>
         <w:rPr>
           <w:rFonts w:ascii="Times New Roman" w:eastAsia="Times New Roman" w:hAnsi="Times New Roman" w:cs="Times New Roman"/>
@@ -4434,16 +4213,7 @@
           <w:kern w:val="0"/>
           <w14:ligatures w14:val="none"/>
         </w:rPr>
-        <w:t xml:space="preserve"> :</w:t>
-      </w:r>
-      <w:proofErr w:type="gramEnd"/>
-      <w:r>
-        <w:rPr>
-          <w:rFonts w:ascii="Times New Roman" w:eastAsia="Times New Roman" w:hAnsi="Times New Roman" w:cs="Times New Roman"/>
-          <w:kern w:val="0"/>
-          <w14:ligatures w14:val="none"/>
-        </w:rPr>
-        <w:t xml:space="preserve"> Total Fertility Rate</w:t>
+        <w:t xml:space="preserve"> : Total Fertility Rate</w:t>
       </w:r>
     </w:p>
     <w:p>
@@ -4457,7 +4227,6 @@
           <w14:ligatures w14:val="none"/>
         </w:rPr>
       </w:pPr>
-      <w:proofErr w:type="gramStart"/>
       <w:r>
         <w:rPr>
           <w:rFonts w:ascii="Times New Roman" w:eastAsia="Times New Roman" w:hAnsi="Times New Roman" w:cs="Times New Roman"/>
@@ -4474,16 +4243,7 @@
           <w:kern w:val="0"/>
           <w14:ligatures w14:val="none"/>
         </w:rPr>
-        <w:t xml:space="preserve"> :</w:t>
-      </w:r>
-      <w:proofErr w:type="gramEnd"/>
-      <w:r>
-        <w:rPr>
-          <w:rFonts w:ascii="Times New Roman" w:eastAsia="Times New Roman" w:hAnsi="Times New Roman" w:cs="Times New Roman"/>
-          <w:kern w:val="0"/>
-          <w14:ligatures w14:val="none"/>
-        </w:rPr>
-        <w:t xml:space="preserve"> Time, Place, and Person</w:t>
+        <w:t xml:space="preserve"> : Time, Place, and Person</w:t>
       </w:r>
     </w:p>
     <w:p>
@@ -4497,7 +4257,6 @@
           <w14:ligatures w14:val="none"/>
         </w:rPr>
       </w:pPr>
-      <w:proofErr w:type="gramStart"/>
       <w:r>
         <w:rPr>
           <w:rFonts w:ascii="Times New Roman" w:eastAsia="Times New Roman" w:hAnsi="Times New Roman" w:cs="Times New Roman"/>
@@ -4514,16 +4273,7 @@
           <w:kern w:val="0"/>
           <w14:ligatures w14:val="none"/>
         </w:rPr>
-        <w:t xml:space="preserve"> :</w:t>
-      </w:r>
-      <w:proofErr w:type="gramEnd"/>
-      <w:r>
-        <w:rPr>
-          <w:rFonts w:ascii="Times New Roman" w:eastAsia="Times New Roman" w:hAnsi="Times New Roman" w:cs="Times New Roman"/>
-          <w:kern w:val="0"/>
-          <w14:ligatures w14:val="none"/>
-        </w:rPr>
-        <w:t xml:space="preserve"> Tanzanian Shillings</w:t>
+        <w:t xml:space="preserve"> : Tanzanian Shillings</w:t>
       </w:r>
     </w:p>
     <w:p>
@@ -4537,7 +4287,6 @@
           <w14:ligatures w14:val="none"/>
         </w:rPr>
       </w:pPr>
-      <w:proofErr w:type="gramStart"/>
       <w:r>
         <w:rPr>
           <w:rFonts w:ascii="Times New Roman" w:eastAsia="Times New Roman" w:hAnsi="Times New Roman" w:cs="Times New Roman"/>
@@ -4554,16 +4303,7 @@
           <w:kern w:val="0"/>
           <w14:ligatures w14:val="none"/>
         </w:rPr>
-        <w:t xml:space="preserve"> :</w:t>
-      </w:r>
-      <w:proofErr w:type="gramEnd"/>
-      <w:r>
-        <w:rPr>
-          <w:rFonts w:ascii="Times New Roman" w:eastAsia="Times New Roman" w:hAnsi="Times New Roman" w:cs="Times New Roman"/>
-          <w:kern w:val="0"/>
-          <w14:ligatures w14:val="none"/>
-        </w:rPr>
-        <w:t xml:space="preserve"> Village Executive Officer</w:t>
+        <w:t xml:space="preserve"> : Village Executive Officer</w:t>
       </w:r>
     </w:p>
     <w:p>
@@ -4577,7 +4317,6 @@
           <w14:ligatures w14:val="none"/>
         </w:rPr>
       </w:pPr>
-      <w:proofErr w:type="gramStart"/>
       <w:r>
         <w:rPr>
           <w:rFonts w:ascii="Times New Roman" w:eastAsia="Times New Roman" w:hAnsi="Times New Roman" w:cs="Times New Roman"/>
@@ -4594,16 +4333,7 @@
           <w:kern w:val="0"/>
           <w14:ligatures w14:val="none"/>
         </w:rPr>
-        <w:t xml:space="preserve"> :</w:t>
-      </w:r>
-      <w:proofErr w:type="gramEnd"/>
-      <w:r>
-        <w:rPr>
-          <w:rFonts w:ascii="Times New Roman" w:eastAsia="Times New Roman" w:hAnsi="Times New Roman" w:cs="Times New Roman"/>
-          <w:kern w:val="0"/>
-          <w14:ligatures w14:val="none"/>
-        </w:rPr>
-        <w:t xml:space="preserve"> World Health Organization</w:t>
+        <w:t xml:space="preserve"> : World Health Organization</w:t>
       </w:r>
     </w:p>
     <w:p>
@@ -4906,61 +4636,25 @@
           <w:kern w:val="0"/>
           <w14:ligatures w14:val="none"/>
         </w:rPr>
-        <w:t xml:space="preserve"> indicates that the </w:t>
-      </w:r>
-      <w:proofErr w:type="spellStart"/>
+        <w:t xml:space="preserve"> indicates that the Pwani Region has a Contraceptive Prevalence Rate (CPR) of </w:t>
+      </w:r>
       <w:r>
         <w:rPr>
           <w:rFonts w:eastAsia="Times New Roman"/>
-          <w:kern w:val="0"/>
-          <w14:ligatures w14:val="none"/>
-        </w:rPr>
-        <w:t>Pwani</w:t>
-      </w:r>
-      <w:proofErr w:type="spellEnd"/>
+          <w:b/>
+          <w:bCs/>
+          <w:kern w:val="0"/>
+          <w14:ligatures w14:val="none"/>
+        </w:rPr>
+        <w:t>35%</w:t>
+      </w:r>
       <w:r>
         <w:rPr>
           <w:rFonts w:eastAsia="Times New Roman"/>
           <w:kern w:val="0"/>
           <w14:ligatures w14:val="none"/>
         </w:rPr>
-        <w:t xml:space="preserve"> Region has a Contraceptive Prevalence Rate (CPR) of </w:t>
-      </w:r>
-      <w:r>
-        <w:rPr>
-          <w:rFonts w:eastAsia="Times New Roman"/>
-          <w:b/>
-          <w:bCs/>
-          <w:kern w:val="0"/>
-          <w14:ligatures w14:val="none"/>
-        </w:rPr>
-        <w:t>35%</w:t>
-      </w:r>
-      <w:r>
-        <w:rPr>
-          <w:rFonts w:eastAsia="Times New Roman"/>
-          <w:kern w:val="0"/>
-          <w14:ligatures w14:val="none"/>
-        </w:rPr>
-        <w:t xml:space="preserve">, which is below the national average of 38% and significantly lower than neighboring coastal regions. Consequently, the Total Fertility Rate (TFR) in </w:t>
-      </w:r>
-      <w:proofErr w:type="spellStart"/>
-      <w:r>
-        <w:rPr>
-          <w:rFonts w:eastAsia="Times New Roman"/>
-          <w:kern w:val="0"/>
-          <w14:ligatures w14:val="none"/>
-        </w:rPr>
-        <w:t>Pwani</w:t>
-      </w:r>
-      <w:proofErr w:type="spellEnd"/>
-      <w:r>
-        <w:rPr>
-          <w:rFonts w:eastAsia="Times New Roman"/>
-          <w:kern w:val="0"/>
-          <w14:ligatures w14:val="none"/>
-        </w:rPr>
-        <w:t xml:space="preserve"> remains high at </w:t>
+        <w:t xml:space="preserve">, which is below the national average of 38% and significantly lower than neighboring coastal regions. Consequently, the Total Fertility Rate (TFR) in Pwani remains high at </w:t>
       </w:r>
       <w:r>
         <w:rPr>
@@ -5043,25 +4737,7 @@
           <w:kern w:val="0"/>
           <w14:ligatures w14:val="none"/>
         </w:rPr>
-        <w:t xml:space="preserve"> District, </w:t>
-      </w:r>
-      <w:proofErr w:type="spellStart"/>
-      <w:r>
-        <w:rPr>
-          <w:rFonts w:ascii="Times New Roman" w:eastAsia="Times New Roman" w:hAnsi="Times New Roman" w:cs="Times New Roman"/>
-          <w:kern w:val="0"/>
-          <w14:ligatures w14:val="none"/>
-        </w:rPr>
-        <w:t>Pwani</w:t>
-      </w:r>
-      <w:proofErr w:type="spellEnd"/>
-      <w:r>
-        <w:rPr>
-          <w:rFonts w:ascii="Times New Roman" w:eastAsia="Times New Roman" w:hAnsi="Times New Roman" w:cs="Times New Roman"/>
-          <w:kern w:val="0"/>
-          <w14:ligatures w14:val="none"/>
-        </w:rPr>
-        <w:t xml:space="preserve"> Region, as of December 2025.</w:t>
+        <w:t xml:space="preserve"> District, Pwani Region, as of December 2025.</w:t>
       </w:r>
     </w:p>
     <w:p>
@@ -5118,7 +4794,27 @@
           <w:kern w:val="0"/>
           <w14:ligatures w14:val="none"/>
         </w:rPr>
-        <w:t>400 women</w:t>
+        <w:t>4</w:t>
+      </w:r>
+      <w:r>
+        <w:rPr>
+          <w:rFonts w:ascii="Times New Roman" w:eastAsia="Times New Roman" w:hAnsi="Times New Roman" w:cs="Times New Roman"/>
+          <w:b/>
+          <w:bCs/>
+          <w:kern w:val="0"/>
+          <w14:ligatures w14:val="none"/>
+        </w:rPr>
+        <w:t>27</w:t>
+      </w:r>
+      <w:r>
+        <w:rPr>
+          <w:rFonts w:ascii="Times New Roman" w:eastAsia="Times New Roman" w:hAnsi="Times New Roman" w:cs="Times New Roman"/>
+          <w:b/>
+          <w:bCs/>
+          <w:kern w:val="0"/>
+          <w14:ligatures w14:val="none"/>
+        </w:rPr>
+        <w:t xml:space="preserve"> women</w:t>
       </w:r>
       <w:r>
         <w:rPr>
@@ -5710,23 +5406,13 @@
         </w:rPr>
         <w:t xml:space="preserve"> using modern methods. However, regional disparities are stark. In the </w:t>
       </w:r>
-      <w:proofErr w:type="spellStart"/>
-      <w:r>
-        <w:rPr>
-          <w:rFonts w:ascii="Times New Roman" w:hAnsi="Times New Roman" w:cs="Times New Roman"/>
-          <w:b/>
-          <w:bCs/>
-        </w:rPr>
-        <w:t>Pwani</w:t>
-      </w:r>
-      <w:proofErr w:type="spellEnd"/>
-      <w:r>
-        <w:rPr>
-          <w:rFonts w:ascii="Times New Roman" w:hAnsi="Times New Roman" w:cs="Times New Roman"/>
-          <w:b/>
-          <w:bCs/>
-        </w:rPr>
-        <w:t xml:space="preserve"> (Coast) Region</w:t>
+      <w:r>
+        <w:rPr>
+          <w:rFonts w:ascii="Times New Roman" w:hAnsi="Times New Roman" w:cs="Times New Roman"/>
+          <w:b/>
+          <w:bCs/>
+        </w:rPr>
+        <w:t>Pwani (Coast) Region</w:t>
       </w:r>
       <w:r>
         <w:rPr>
@@ -5774,21 +5460,7 @@
         <w:rPr>
           <w:rFonts w:ascii="Times New Roman" w:hAnsi="Times New Roman" w:cs="Times New Roman"/>
         </w:rPr>
-        <w:t xml:space="preserve">. The Total Fertility Rate (TFR) in </w:t>
-      </w:r>
-      <w:proofErr w:type="spellStart"/>
-      <w:r>
-        <w:rPr>
-          <w:rFonts w:ascii="Times New Roman" w:hAnsi="Times New Roman" w:cs="Times New Roman"/>
-        </w:rPr>
-        <w:t>Pwani</w:t>
-      </w:r>
-      <w:proofErr w:type="spellEnd"/>
-      <w:r>
-        <w:rPr>
-          <w:rFonts w:ascii="Times New Roman" w:hAnsi="Times New Roman" w:cs="Times New Roman"/>
-        </w:rPr>
-        <w:t xml:space="preserve"> remains high at </w:t>
+        <w:t xml:space="preserve">. The Total Fertility Rate (TFR) in Pwani remains high at </w:t>
       </w:r>
       <w:r>
         <w:rPr>
@@ -5830,21 +5502,7 @@
         <w:rPr>
           <w:rFonts w:ascii="Times New Roman" w:hAnsi="Times New Roman" w:cs="Times New Roman"/>
         </w:rPr>
-        <w:t xml:space="preserve">. Furthermore, the unmet need for family planning in the </w:t>
-      </w:r>
-      <w:proofErr w:type="spellStart"/>
-      <w:r>
-        <w:rPr>
-          <w:rFonts w:ascii="Times New Roman" w:hAnsi="Times New Roman" w:cs="Times New Roman"/>
-        </w:rPr>
-        <w:t>Pwani</w:t>
-      </w:r>
-      <w:proofErr w:type="spellEnd"/>
-      <w:r>
-        <w:rPr>
-          <w:rFonts w:ascii="Times New Roman" w:hAnsi="Times New Roman" w:cs="Times New Roman"/>
-        </w:rPr>
-        <w:t xml:space="preserve"> region stands at </w:t>
+        <w:t xml:space="preserve">. Furthermore, the unmet need for family planning in the Pwani region stands at </w:t>
       </w:r>
       <w:r>
         <w:rPr>
@@ -6043,21 +5701,7 @@
         <w:rPr>
           <w:rFonts w:ascii="Times New Roman" w:hAnsi="Times New Roman" w:cs="Times New Roman"/>
         </w:rPr>
-        <w:t xml:space="preserve">Despite the availability of free family planning services in Tanzania, the uptake of modern contraceptives in the </w:t>
-      </w:r>
-      <w:proofErr w:type="spellStart"/>
-      <w:r>
-        <w:rPr>
-          <w:rFonts w:ascii="Times New Roman" w:hAnsi="Times New Roman" w:cs="Times New Roman"/>
-        </w:rPr>
-        <w:t>Pwani</w:t>
-      </w:r>
-      <w:proofErr w:type="spellEnd"/>
-      <w:r>
-        <w:rPr>
-          <w:rFonts w:ascii="Times New Roman" w:hAnsi="Times New Roman" w:cs="Times New Roman"/>
-        </w:rPr>
-        <w:t xml:space="preserve"> Region remains suboptimal compared to national targets. Data from the TDHS 2022 indicates that the region has a modern contraceptive prevalence rate of only 31% among married women, while 20.9% have an unmet need for family planning </w:t>
+        <w:t xml:space="preserve">Despite the availability of free family planning services in Tanzania, the uptake of modern contraceptives in the Pwani Region remains suboptimal compared to national targets. Data from the TDHS 2022 indicates that the region has a modern contraceptive prevalence rate of only 31% among married women, while 20.9% have an unmet need for family planning </w:t>
       </w:r>
       <w:sdt>
         <w:sdtPr>
@@ -6596,25 +6240,7 @@
           <w:kern w:val="0"/>
           <w14:ligatures w14:val="none"/>
         </w:rPr>
-        <w:t xml:space="preserve"> indicates that the </w:t>
-      </w:r>
-      <w:proofErr w:type="spellStart"/>
-      <w:r>
-        <w:rPr>
-          <w:rFonts w:ascii="Times New Roman" w:eastAsia="Times New Roman" w:hAnsi="Times New Roman" w:cs="Times New Roman"/>
-          <w:kern w:val="0"/>
-          <w14:ligatures w14:val="none"/>
-        </w:rPr>
-        <w:t>Pwani</w:t>
-      </w:r>
-      <w:proofErr w:type="spellEnd"/>
-      <w:r>
-        <w:rPr>
-          <w:rFonts w:ascii="Times New Roman" w:eastAsia="Times New Roman" w:hAnsi="Times New Roman" w:cs="Times New Roman"/>
-          <w:kern w:val="0"/>
-          <w14:ligatures w14:val="none"/>
-        </w:rPr>
-        <w:t xml:space="preserve"> Region has a Contraceptive Prevalence Rate (CPR) of 35%, there is a scarcity of community-based quantitative evidence explaining the specific drivers of this low uptake in rural districts like </w:t>
+        <w:t xml:space="preserve"> indicates that the Pwani Region has a Contraceptive Prevalence Rate (CPR) of 35%, there is a scarcity of community-based quantitative evidence explaining the specific drivers of this low uptake in rural districts like </w:t>
       </w:r>
       <w:proofErr w:type="spellStart"/>
       <w:r>
@@ -7025,25 +6651,7 @@
           <w:sz w:val="24"/>
           <w:szCs w:val="24"/>
         </w:rPr>
-        <w:t xml:space="preserve"> District, </w:t>
-      </w:r>
-      <w:proofErr w:type="spellStart"/>
-      <w:r>
-        <w:rPr>
-          <w:rFonts w:ascii="Times New Roman" w:hAnsi="Times New Roman" w:cs="Times New Roman"/>
-          <w:sz w:val="24"/>
-          <w:szCs w:val="24"/>
-        </w:rPr>
-        <w:t>Pwani</w:t>
-      </w:r>
-      <w:proofErr w:type="spellEnd"/>
-      <w:r>
-        <w:rPr>
-          <w:rFonts w:ascii="Times New Roman" w:hAnsi="Times New Roman" w:cs="Times New Roman"/>
-          <w:sz w:val="24"/>
-          <w:szCs w:val="24"/>
-        </w:rPr>
-        <w:t xml:space="preserve"> Region, as of December 2025.</w:t>
+        <w:t xml:space="preserve"> District, Pwani Region, as of December 2025.</w:t>
       </w:r>
       <w:bookmarkEnd w:id="9"/>
     </w:p>
@@ -7683,21 +7291,7 @@
         <w:rPr>
           <w:rFonts w:ascii="Times New Roman" w:hAnsi="Times New Roman" w:cs="Times New Roman"/>
         </w:rPr>
-        <w:t xml:space="preserve"> </w:t>
-      </w:r>
-      <w:proofErr w:type="gramStart"/>
-      <w:r>
-        <w:rPr>
-          <w:rFonts w:ascii="Times New Roman" w:hAnsi="Times New Roman" w:cs="Times New Roman"/>
-        </w:rPr>
-        <w:t>reports</w:t>
-      </w:r>
-      <w:proofErr w:type="gramEnd"/>
-      <w:r>
-        <w:rPr>
-          <w:rFonts w:ascii="Times New Roman" w:hAnsi="Times New Roman" w:cs="Times New Roman"/>
-        </w:rPr>
-        <w:t xml:space="preserve"> a national Contraceptive Prevalence Rate (CPR) of </w:t>
+        <w:t xml:space="preserve"> reports a national Contraceptive Prevalence Rate (CPR) of </w:t>
       </w:r>
       <w:r>
         <w:rPr>
@@ -7755,23 +7349,13 @@
         </w:rPr>
         <w:t xml:space="preserve">. However, regional heterogeneity is stark. The </w:t>
       </w:r>
-      <w:proofErr w:type="spellStart"/>
-      <w:r>
-        <w:rPr>
-          <w:rFonts w:ascii="Times New Roman" w:hAnsi="Times New Roman" w:cs="Times New Roman"/>
-          <w:b/>
-          <w:bCs/>
-        </w:rPr>
-        <w:t>Pwani</w:t>
-      </w:r>
-      <w:proofErr w:type="spellEnd"/>
-      <w:r>
-        <w:rPr>
-          <w:rFonts w:ascii="Times New Roman" w:hAnsi="Times New Roman" w:cs="Times New Roman"/>
-          <w:b/>
-          <w:bCs/>
-        </w:rPr>
-        <w:t xml:space="preserve"> Region</w:t>
+      <w:r>
+        <w:rPr>
+          <w:rFonts w:ascii="Times New Roman" w:hAnsi="Times New Roman" w:cs="Times New Roman"/>
+          <w:b/>
+          <w:bCs/>
+        </w:rPr>
+        <w:t>Pwani Region</w:t>
       </w:r>
       <w:r>
         <w:rPr>
@@ -7791,7 +7375,14 @@
         <w:rPr>
           <w:rFonts w:ascii="Times New Roman" w:hAnsi="Times New Roman" w:cs="Times New Roman"/>
         </w:rPr>
-        <w:t xml:space="preserve">, which is lower than the national average and significantly lower than neighboring Lindi (46%) and Mtwara (40%) </w:t>
+        <w:t xml:space="preserve">, which is lower than the national average and significantly lower than neighboring Lindi </w:t>
+      </w:r>
+      <w:r>
+        <w:rPr>
+          <w:rFonts w:ascii="Times New Roman" w:hAnsi="Times New Roman" w:cs="Times New Roman"/>
+        </w:rPr>
+        <w:lastRenderedPageBreak/>
+        <w:t xml:space="preserve">(46%) and Mtwara (40%) </w:t>
       </w:r>
       <w:sdt>
         <w:sdtPr>
@@ -7819,14 +7410,7 @@
         <w:rPr>
           <w:rFonts w:ascii="Times New Roman" w:hAnsi="Times New Roman" w:cs="Times New Roman"/>
         </w:rPr>
-        <w:t xml:space="preserve">. This persistent low prevalence contributes to the region’s Total </w:t>
-      </w:r>
-      <w:r>
-        <w:rPr>
-          <w:rFonts w:ascii="Times New Roman" w:hAnsi="Times New Roman" w:cs="Times New Roman"/>
-        </w:rPr>
-        <w:lastRenderedPageBreak/>
-        <w:t xml:space="preserve">Fertility Rate (TFR) of </w:t>
+        <w:t xml:space="preserve">. This persistent low prevalence contributes to the region’s Total Fertility Rate (TFR) of </w:t>
       </w:r>
       <w:r>
         <w:rPr>
@@ -7840,35 +7424,7 @@
         <w:rPr>
           <w:rFonts w:ascii="Times New Roman" w:hAnsi="Times New Roman" w:cs="Times New Roman"/>
         </w:rPr>
-        <w:t xml:space="preserve">, which remains higher than the urban average of </w:t>
-      </w:r>
-      <w:proofErr w:type="gramStart"/>
-      <w:r>
-        <w:rPr>
-          <w:rFonts w:ascii="Times New Roman" w:hAnsi="Times New Roman" w:cs="Times New Roman"/>
-        </w:rPr>
-        <w:t>2.8 .</w:t>
-      </w:r>
-      <w:proofErr w:type="gramEnd"/>
-      <w:r>
-        <w:rPr>
-          <w:rFonts w:ascii="Times New Roman" w:hAnsi="Times New Roman" w:cs="Times New Roman"/>
-        </w:rPr>
-        <w:t xml:space="preserve"> Hospital-based data from the Coast Region suggests a slightly higher prevalence (36.8%) among women already attending clinics, but </w:t>
-      </w:r>
-      <w:proofErr w:type="gramStart"/>
-      <w:r>
-        <w:rPr>
-          <w:rFonts w:ascii="Times New Roman" w:hAnsi="Times New Roman" w:cs="Times New Roman"/>
-        </w:rPr>
-        <w:t>this likely overestimates</w:t>
-      </w:r>
-      <w:proofErr w:type="gramEnd"/>
-      <w:r>
-        <w:rPr>
-          <w:rFonts w:ascii="Times New Roman" w:hAnsi="Times New Roman" w:cs="Times New Roman"/>
-        </w:rPr>
-        <w:t xml:space="preserve"> community-level usage due to selection bias </w:t>
+        <w:t xml:space="preserve">, which remains higher than the urban average of 2.8 . Hospital-based data from the Coast Region suggests a slightly higher prevalence (36.8%) among women already attending clinics, but this likely overestimates community-level usage due to selection bias </w:t>
       </w:r>
       <w:sdt>
         <w:sdtPr>
@@ -8163,7 +7719,14 @@
         <w:rPr>
           <w:rFonts w:ascii="Times New Roman" w:hAnsi="Times New Roman" w:cs="Times New Roman"/>
         </w:rPr>
-        <w:t>The quality of knowledge is further compromised by the prevalence of misinformation and myths which function as "negative knowledge." Research conducted at Tumbi Regional Referral Hospital in the Coast Region indicates that non-use is often driven by unfounded beliefs that contraceptives cause cancer (9.6%) or result in permanent infertility, rather than a lack of access</w:t>
+        <w:t xml:space="preserve">The quality of knowledge is further compromised by the prevalence of misinformation and myths which function as "negative knowledge." Research conducted at Tumbi Regional Referral Hospital in the Coast Region indicates that non-use is often driven by unfounded beliefs that contraceptives </w:t>
+      </w:r>
+      <w:r>
+        <w:rPr>
+          <w:rFonts w:ascii="Times New Roman" w:hAnsi="Times New Roman" w:cs="Times New Roman"/>
+        </w:rPr>
+        <w:lastRenderedPageBreak/>
+        <w:t>cause cancer (9.6%) or result in permanent infertility, rather than a lack of access</w:t>
       </w:r>
       <w:sdt>
         <w:sdtPr>
@@ -8191,14 +7754,7 @@
         <w:rPr>
           <w:rFonts w:ascii="Times New Roman" w:hAnsi="Times New Roman" w:cs="Times New Roman"/>
         </w:rPr>
-        <w:t xml:space="preserve">. Similarly, in </w:t>
-      </w:r>
-      <w:r>
-        <w:rPr>
-          <w:rFonts w:ascii="Times New Roman" w:hAnsi="Times New Roman" w:cs="Times New Roman"/>
-        </w:rPr>
-        <w:lastRenderedPageBreak/>
-        <w:t>Pemba, women reported social perceptions that modern contraceptives reduce the future workforce and cited fear of side effects as a primary barrier, indicating that their "knowledge" is often constituted by community hearsay rather than clinical fact</w:t>
+        <w:t>. Similarly, in Pemba, women reported social perceptions that modern contraceptives reduce the future workforce and cited fear of side effects as a primary barrier, indicating that their "knowledge" is often constituted by community hearsay rather than clinical fact</w:t>
       </w:r>
       <w:sdt>
         <w:sdtPr>
@@ -8241,27 +7797,13 @@
         <w:rPr>
           <w:rFonts w:ascii="Times New Roman" w:hAnsi="Times New Roman" w:cs="Times New Roman"/>
         </w:rPr>
-        <w:t xml:space="preserve">Finally, </w:t>
-      </w:r>
-      <w:proofErr w:type="gramStart"/>
-      <w:r>
-        <w:rPr>
-          <w:rFonts w:ascii="Times New Roman" w:hAnsi="Times New Roman" w:cs="Times New Roman"/>
-        </w:rPr>
-        <w:t>Th</w:t>
-      </w:r>
-      <w:r>
-        <w:rPr>
-          <w:rFonts w:ascii="Times New Roman" w:hAnsi="Times New Roman" w:cs="Times New Roman"/>
-        </w:rPr>
-        <w:t>e</w:t>
-      </w:r>
-      <w:proofErr w:type="gramEnd"/>
-      <w:r>
-        <w:rPr>
-          <w:rFonts w:ascii="Times New Roman" w:hAnsi="Times New Roman" w:cs="Times New Roman"/>
-        </w:rPr>
-        <w:t xml:space="preserve"> studies</w:t>
+        <w:t>Finally, Th</w:t>
+      </w:r>
+      <w:r>
+        <w:rPr>
+          <w:rFonts w:ascii="Times New Roman" w:hAnsi="Times New Roman" w:cs="Times New Roman"/>
+        </w:rPr>
+        <w:t>e studies</w:t>
       </w:r>
       <w:r>
         <w:rPr>
@@ -8422,21 +7964,7 @@
         <w:rPr>
           <w:rFonts w:ascii="Times New Roman" w:hAnsi="Times New Roman" w:cs="Times New Roman"/>
         </w:rPr>
-        <w:t xml:space="preserve">. Quantitative data from the </w:t>
-      </w:r>
-      <w:proofErr w:type="spellStart"/>
-      <w:r>
-        <w:rPr>
-          <w:rFonts w:ascii="Times New Roman" w:hAnsi="Times New Roman" w:cs="Times New Roman"/>
-        </w:rPr>
-        <w:t>Pwani</w:t>
-      </w:r>
-      <w:proofErr w:type="spellEnd"/>
-      <w:r>
-        <w:rPr>
-          <w:rFonts w:ascii="Times New Roman" w:hAnsi="Times New Roman" w:cs="Times New Roman"/>
-        </w:rPr>
-        <w:t xml:space="preserve"> Region reinforces this; women whose partners were unaware of their contraceptive use were 60% less likely (AOR=0.4) to continue using the method </w:t>
+        <w:t xml:space="preserve">. Quantitative data from the Pwani Region reinforces this; women whose partners were unaware of their contraceptive use were 60% less likely (AOR=0.4) to continue using the method </w:t>
       </w:r>
       <w:sdt>
         <w:sdtPr>
@@ -8528,7 +8056,6 @@
         <w:t xml:space="preserve">Myths and </w:t>
       </w:r>
       <w:proofErr w:type="spellStart"/>
-      <w:proofErr w:type="gramStart"/>
       <w:r>
         <w:rPr>
           <w:rFonts w:ascii="Times New Roman" w:hAnsi="Times New Roman" w:cs="Times New Roman"/>
@@ -8544,7 +8071,6 @@
         <w:t>Myths</w:t>
       </w:r>
       <w:proofErr w:type="spellEnd"/>
-      <w:proofErr w:type="gramEnd"/>
       <w:r>
         <w:rPr>
           <w:rFonts w:ascii="Times New Roman" w:hAnsi="Times New Roman" w:cs="Times New Roman"/>
@@ -8655,7 +8181,6 @@
         <w:t xml:space="preserve">Religious and Cultural </w:t>
       </w:r>
       <w:proofErr w:type="spellStart"/>
-      <w:proofErr w:type="gramStart"/>
       <w:r>
         <w:rPr>
           <w:rFonts w:ascii="Times New Roman" w:hAnsi="Times New Roman" w:cs="Times New Roman"/>
@@ -8671,7 +8196,6 @@
         <w:t>Religious</w:t>
       </w:r>
       <w:proofErr w:type="spellEnd"/>
-      <w:proofErr w:type="gramEnd"/>
       <w:r>
         <w:rPr>
           <w:rFonts w:ascii="Times New Roman" w:hAnsi="Times New Roman" w:cs="Times New Roman"/>
@@ -8704,7 +8228,14 @@
         <w:rPr>
           <w:rFonts w:ascii="Times New Roman" w:hAnsi="Times New Roman" w:cs="Times New Roman"/>
         </w:rPr>
-        <w:t xml:space="preserve">. In the Tanzanian coastal context, specifically among the </w:t>
+        <w:t xml:space="preserve">. In the Tanzanian coastal context, </w:t>
+      </w:r>
+      <w:r>
+        <w:rPr>
+          <w:rFonts w:ascii="Times New Roman" w:hAnsi="Times New Roman" w:cs="Times New Roman"/>
+        </w:rPr>
+        <w:lastRenderedPageBreak/>
+        <w:t xml:space="preserve">specifically among the </w:t>
       </w:r>
       <w:proofErr w:type="spellStart"/>
       <w:r>
@@ -8732,14 +8263,7 @@
         <w:rPr>
           <w:rFonts w:ascii="Times New Roman" w:hAnsi="Times New Roman" w:cs="Times New Roman"/>
         </w:rPr>
-        <w:t xml:space="preserve"> tribes, high parity is culturally associated with </w:t>
-      </w:r>
-      <w:r>
-        <w:rPr>
-          <w:rFonts w:ascii="Times New Roman" w:hAnsi="Times New Roman" w:cs="Times New Roman"/>
-        </w:rPr>
-        <w:lastRenderedPageBreak/>
-        <w:t xml:space="preserve">prestige and the continuation of the clan </w:t>
+        <w:t xml:space="preserve"> tribes, high parity is culturally associated with prestige and the continuation of the clan </w:t>
       </w:r>
       <w:sdt>
         <w:sdtPr>
@@ -8868,21 +8392,7 @@
         <w:rPr>
           <w:rFonts w:ascii="Times New Roman" w:hAnsi="Times New Roman" w:cs="Times New Roman"/>
         </w:rPr>
-        <w:t xml:space="preserve">The literature establishes that while socio-demographic factors like education are fundamental, the decision to use contraceptives in Sub-Saharan Africa is heavily mediated by socio-cultural dynamics. The "Knowledge-Practice Gap" is driven not by a lack of awareness, but by the prevalence of myths, partner opposition, and cultural prestige associated with high fertility. However, most existing data on these cultural barriers in the </w:t>
-      </w:r>
-      <w:proofErr w:type="spellStart"/>
-      <w:r>
-        <w:rPr>
-          <w:rFonts w:ascii="Times New Roman" w:hAnsi="Times New Roman" w:cs="Times New Roman"/>
-        </w:rPr>
-        <w:t>Pwani</w:t>
-      </w:r>
-      <w:proofErr w:type="spellEnd"/>
-      <w:r>
-        <w:rPr>
-          <w:rFonts w:ascii="Times New Roman" w:hAnsi="Times New Roman" w:cs="Times New Roman"/>
-        </w:rPr>
-        <w:t xml:space="preserve"> Region is derived from hospital-based studies </w:t>
+        <w:t xml:space="preserve">The literature establishes that while socio-demographic factors like education are fundamental, the decision to use contraceptives in Sub-Saharan Africa is heavily mediated by socio-cultural dynamics. The "Knowledge-Practice Gap" is driven not by a lack of awareness, but by the prevalence of myths, partner opposition, and cultural prestige associated with high fertility. However, most existing data on these cultural barriers in the Pwani Region is derived from hospital-based studies </w:t>
       </w:r>
       <w:sdt>
         <w:sdtPr>
@@ -9216,21 +8726,7 @@
         <w:rPr>
           <w:rFonts w:ascii="Times New Roman" w:hAnsi="Times New Roman" w:cs="Times New Roman"/>
         </w:rPr>
-        <w:t xml:space="preserve"> District, one of the seven districts of the </w:t>
-      </w:r>
-      <w:proofErr w:type="spellStart"/>
-      <w:r>
-        <w:rPr>
-          <w:rFonts w:ascii="Times New Roman" w:hAnsi="Times New Roman" w:cs="Times New Roman"/>
-        </w:rPr>
-        <w:t>Pwani</w:t>
-      </w:r>
-      <w:proofErr w:type="spellEnd"/>
-      <w:r>
-        <w:rPr>
-          <w:rFonts w:ascii="Times New Roman" w:hAnsi="Times New Roman" w:cs="Times New Roman"/>
-        </w:rPr>
-        <w:t xml:space="preserve"> (Coast) Region in Tanzania.</w:t>
+        <w:t xml:space="preserve"> District, one of the seven districts of the Pwani (Coast) Region in Tanzania.</w:t>
       </w:r>
     </w:p>
     <w:p>
@@ -9304,21 +8800,7 @@
         <w:rPr>
           <w:rFonts w:ascii="Times New Roman" w:hAnsi="Times New Roman" w:cs="Times New Roman"/>
         </w:rPr>
-        <w:t xml:space="preserve">, the </w:t>
-      </w:r>
-      <w:proofErr w:type="spellStart"/>
-      <w:r>
-        <w:rPr>
-          <w:rFonts w:ascii="Times New Roman" w:hAnsi="Times New Roman" w:cs="Times New Roman"/>
-        </w:rPr>
-        <w:t>Pwani</w:t>
-      </w:r>
-      <w:proofErr w:type="spellEnd"/>
-      <w:r>
-        <w:rPr>
-          <w:rFonts w:ascii="Times New Roman" w:hAnsi="Times New Roman" w:cs="Times New Roman"/>
-        </w:rPr>
-        <w:t xml:space="preserve"> Region has a modern Contraceptive Prevalence Rate (CPR) of </w:t>
+        <w:t xml:space="preserve">, the Pwani Region has a modern Contraceptive Prevalence Rate (CPR) of </w:t>
       </w:r>
       <w:r>
         <w:rPr>
@@ -9901,7 +9383,6 @@
         <w:t xml:space="preserve">Based on Prevalence of Modern Contraceptive </w:t>
       </w:r>
       <w:proofErr w:type="spellStart"/>
-      <w:proofErr w:type="gramStart"/>
       <w:r>
         <w:rPr>
           <w:rFonts w:ascii="Times New Roman" w:eastAsiaTheme="minorEastAsia" w:hAnsi="Times New Roman" w:cs="Times New Roman"/>
@@ -9917,26 +9398,11 @@
         <w:t>:Using</w:t>
       </w:r>
       <w:proofErr w:type="spellEnd"/>
-      <w:proofErr w:type="gramEnd"/>
       <w:r>
         <w:rPr>
           <w:rFonts w:ascii="Times New Roman" w:eastAsiaTheme="minorEastAsia" w:hAnsi="Times New Roman" w:cs="Times New Roman"/>
         </w:rPr>
-        <w:t xml:space="preserve"> the Tanzania Demographic and Health Survey (TDHS) 2022 data for the </w:t>
-      </w:r>
-      <w:proofErr w:type="spellStart"/>
-      <w:r>
-        <w:rPr>
-          <w:rFonts w:ascii="Times New Roman" w:eastAsiaTheme="minorEastAsia" w:hAnsi="Times New Roman" w:cs="Times New Roman"/>
-        </w:rPr>
-        <w:t>Pwani</w:t>
-      </w:r>
-      <w:proofErr w:type="spellEnd"/>
-      <w:r>
-        <w:rPr>
-          <w:rFonts w:ascii="Times New Roman" w:eastAsiaTheme="minorEastAsia" w:hAnsi="Times New Roman" w:cs="Times New Roman"/>
-        </w:rPr>
-        <w:t xml:space="preserve"> Region, the prevalence of modern contraceptive use is 31% (p=0.31%).</w:t>
+        <w:t xml:space="preserve"> the Tanzania Demographic and Health Survey (TDHS) 2022 data for the Pwani Region, the prevalence of modern contraceptive use is 31% (p=0.31%).</w:t>
       </w:r>
     </w:p>
     <w:p>
@@ -10489,17 +9955,9 @@
         <w:rPr>
           <w:rFonts w:ascii="Times New Roman" w:hAnsi="Times New Roman" w:cs="Times New Roman"/>
         </w:rPr>
-        <w:t>Non-</w:t>
-      </w:r>
-      <w:proofErr w:type="gramStart"/>
-      <w:r>
-        <w:rPr>
-          <w:rFonts w:ascii="Times New Roman" w:hAnsi="Times New Roman" w:cs="Times New Roman"/>
-        </w:rPr>
-        <w:t>Response:To</w:t>
+        <w:t>Non-Response:To</w:t>
       </w:r>
       <w:proofErr w:type="spellEnd"/>
-      <w:proofErr w:type="gramEnd"/>
       <w:r>
         <w:rPr>
           <w:rFonts w:ascii="Times New Roman" w:hAnsi="Times New Roman" w:cs="Times New Roman"/>
@@ -11281,29 +10739,7 @@
           <w:kern w:val="0"/>
           <w14:ligatures w14:val="none"/>
         </w:rPr>
-        <w:t>She will be classified as a "</w:t>
-      </w:r>
-      <w:proofErr w:type="gramStart"/>
-      <w:r>
-        <w:rPr>
-          <w:rFonts w:ascii="Times New Roman" w:eastAsia="Times New Roman" w:hAnsi="Times New Roman" w:cs="Times New Roman"/>
-          <w:b/>
-          <w:bCs/>
-          <w:kern w:val="0"/>
-          <w14:ligatures w14:val="none"/>
-        </w:rPr>
-        <w:t>Non-User</w:t>
-      </w:r>
-      <w:proofErr w:type="gramEnd"/>
-      <w:r>
-        <w:rPr>
-          <w:rFonts w:ascii="Times New Roman" w:eastAsia="Times New Roman" w:hAnsi="Times New Roman" w:cs="Times New Roman"/>
-          <w:b/>
-          <w:bCs/>
-          <w:kern w:val="0"/>
-          <w14:ligatures w14:val="none"/>
-        </w:rPr>
-        <w:t>" if she is not currently using any modern method</w:t>
+        <w:t>She will be classified as a "Non-User" if she is not currently using any modern method</w:t>
       </w:r>
       <w:r>
         <w:rPr>
@@ -12869,13 +12305,8 @@
       <w:r>
         <w:t xml:space="preserve">less than </w:t>
       </w:r>
-      <w:proofErr w:type="gramStart"/>
-      <w:r>
-        <w:t>Mean</w:t>
-      </w:r>
-      <w:proofErr w:type="gramEnd"/>
-      <w:r>
-        <w:t>). The proportion of women in each category will be reported.</w:t>
+      <w:r>
+        <w:t>Mean). The proportion of women in each category will be reported.</w:t>
       </w:r>
     </w:p>
     <w:p>
@@ -18626,21 +18057,7 @@
             <w:rPr>
               <w:rFonts w:ascii="Times New Roman" w:eastAsia="Times New Roman" w:hAnsi="Times New Roman" w:cs="Times New Roman"/>
             </w:rPr>
-            <w:t xml:space="preserve"> S, Lovell S. Understanding the contextual and cultural influences on women’s modern contraceptive use in East Uganda: A qualitative study. PLOS Global Public Health [Internet]. 2022 Aug 1 [cited 2025 Dec 9];2(8</w:t>
-          </w:r>
-          <w:proofErr w:type="gramStart"/>
-          <w:r>
-            <w:rPr>
-              <w:rFonts w:ascii="Times New Roman" w:eastAsia="Times New Roman" w:hAnsi="Times New Roman" w:cs="Times New Roman"/>
-            </w:rPr>
-            <w:t>):e</w:t>
-          </w:r>
-          <w:proofErr w:type="gramEnd"/>
-          <w:r>
-            <w:rPr>
-              <w:rFonts w:ascii="Times New Roman" w:eastAsia="Times New Roman" w:hAnsi="Times New Roman" w:cs="Times New Roman"/>
-            </w:rPr>
-            <w:t>0000545. Available from: https://journals.plos.org/globalpublichealth/article?id=10.1371/journal.pgph.0000545</w:t>
+            <w:t xml:space="preserve"> S, Lovell S. Understanding the contextual and cultural influences on women’s modern contraceptive use in East Uganda: A qualitative study. PLOS Global Public Health [Internet]. 2022 Aug 1 [cited 2025 Dec 9];2(8):e0000545. Available from: https://journals.plos.org/globalpublichealth/article?id=10.1371/journal.pgph.0000545</w:t>
           </w:r>
         </w:p>
         <w:p>
@@ -18783,21 +18200,7 @@
               <w:rFonts w:ascii="Times New Roman" w:eastAsia="Times New Roman" w:hAnsi="Times New Roman" w:cs="Times New Roman"/>
             </w:rPr>
             <w:tab/>
-            <w:t xml:space="preserve">Kitula MDN. Women Status and Culture on Contraceptive Use: The Case of Mbeya and </w:t>
-          </w:r>
-          <w:proofErr w:type="spellStart"/>
-          <w:r>
-            <w:rPr>
-              <w:rFonts w:ascii="Times New Roman" w:eastAsia="Times New Roman" w:hAnsi="Times New Roman" w:cs="Times New Roman"/>
-            </w:rPr>
-            <w:t>Pwani</w:t>
-          </w:r>
-          <w:proofErr w:type="spellEnd"/>
-          <w:r>
-            <w:rPr>
-              <w:rFonts w:ascii="Times New Roman" w:eastAsia="Times New Roman" w:hAnsi="Times New Roman" w:cs="Times New Roman"/>
-            </w:rPr>
-            <w:t xml:space="preserve"> Regions. Huria: Journal of the Open University of Tanzania [Internet]. 2017 Dec 30 </w:t>
+            <w:t xml:space="preserve">Kitula MDN. Women Status and Culture on Contraceptive Use: The Case of Mbeya and Pwani Regions. Huria: Journal of the Open University of Tanzania [Internet]. 2017 Dec 30 </w:t>
           </w:r>
           <w:r>
             <w:rPr>
@@ -25133,9 +24536,11 @@
     <w:rsid w:val="00887B9E"/>
     <w:rsid w:val="00902DF8"/>
     <w:rsid w:val="00AA0F75"/>
+    <w:rsid w:val="00B578E4"/>
     <w:rsid w:val="00C5375A"/>
     <w:rsid w:val="00CC613F"/>
     <w:rsid w:val="00CD77EB"/>
+    <w:rsid w:val="00EA189A"/>
     <w:rsid w:val="00F4176F"/>
   </w:rsids>
   <m:mathPr>

</xml_diff>